<commit_message>
adding RF tutorial and minor edits
</commit_message>
<xml_diff>
--- a/intake-forms/api-form.docx
+++ b/intake-forms/api-form.docx
@@ -594,6 +594,88 @@
         <w:pStyle w:val="Heading2"/>
       </w:pPr>
       <w:r>
+        <w:t xml:space="preserve">Interactive docs URL</w:t>
+      </w:r>
+    </w:p>
+    <w:p>
+      <w:pPr>
+        <w:pStyle w:val="Guidance"/>
+        <w:spacing w:after="80"/>
+      </w:pPr>
+      <w:r>
+        <w:rPr>
+          <w:i/>
+          <w:color w:val="5E6874"/>
+          <w:sz w:val="18"/>
+        </w:rPr>
+        <w:t xml:space="preserve">Address of the API's own interactive documentation, if it has any. This becomes a button on the page.</w:t>
+      </w:r>
+    </w:p>
+    <w:p>
+      <w:pPr>
+        <w:pStyle w:val="Guidance"/>
+        <w:spacing w:after="80"/>
+      </w:pPr>
+      <w:r>
+        <w:rPr>
+          <w:i/>
+          <w:color w:val="0F6F7D"/>
+          <w:sz w:val="18"/>
+        </w:rPr>
+        <w:t xml:space="preserve">Example: https://enso.iwmi.org/ENSO_api/docs</w:t>
+      </w:r>
+    </w:p>
+    <w:p>
+      <w:pPr>
+        <w:pStyle w:val="Answer"/>
+        <w:spacing w:after="280"/>
+      </w:pPr>
+      <w:r>
+        <w:rPr>
+          <w:color w:val="999999"/>
+        </w:rPr>
+        <w:t>Type your answer here</w:t>
+      </w:r>
+    </w:p>
+    <w:p>
+      <w:pPr>
+        <w:pStyle w:val="Heading2"/>
+      </w:pPr>
+      <w:r>
+        <w:t xml:space="preserve">Service URL</w:t>
+      </w:r>
+    </w:p>
+    <w:p>
+      <w:pPr>
+        <w:pStyle w:val="Guidance"/>
+        <w:spacing w:after="80"/>
+      </w:pPr>
+      <w:r>
+        <w:rPr>
+          <w:i/>
+          <w:color w:val="5E6874"/>
+          <w:sz w:val="18"/>
+        </w:rPr>
+        <w:t xml:space="preserve">Address of the service or dashboard this API sits behind, if there is one.</w:t>
+      </w:r>
+    </w:p>
+    <w:p>
+      <w:pPr>
+        <w:pStyle w:val="Answer"/>
+        <w:spacing w:after="280"/>
+      </w:pPr>
+      <w:r>
+        <w:rPr>
+          <w:color w:val="999999"/>
+        </w:rPr>
+        <w:t>Type your answer here</w:t>
+      </w:r>
+    </w:p>
+    <w:p>
+      <w:pPr>
+        <w:pStyle w:val="Heading2"/>
+      </w:pPr>
+      <w:r>
         <w:t>Related tool</w:t>
       </w:r>
     </w:p>
@@ -905,6 +987,102 @@
           <w:sz w:val="16"/>
         </w:rPr>
         <w:t>One per line.</w:t>
+      </w:r>
+    </w:p>
+    <w:p>
+      <w:pPr>
+        <w:pStyle w:val="Answer"/>
+        <w:spacing w:after="280"/>
+      </w:pPr>
+      <w:r>
+        <w:rPr>
+          <w:color w:val="999999"/>
+        </w:rPr>
+        <w:t>Type your answer here</w:t>
+      </w:r>
+    </w:p>
+    <w:p>
+      <w:pPr>
+        <w:pStyle w:val="Heading2"/>
+      </w:pPr>
+      <w:r>
+        <w:t xml:space="preserve">Weight</w:t>
+      </w:r>
+    </w:p>
+    <w:p>
+      <w:pPr>
+        <w:pStyle w:val="Guidance"/>
+        <w:spacing w:after="80"/>
+      </w:pPr>
+      <w:r>
+        <w:rPr>
+          <w:i/>
+          <w:color w:val="5E6874"/>
+          <w:sz w:val="18"/>
+        </w:rPr>
+        <w:t xml:space="preserve">Sort order in the listing page. Higher numbers appear first. Leave empty unless you want this page pinned near the top.</w:t>
+      </w:r>
+    </w:p>
+    <w:p>
+      <w:pPr>
+        <w:pStyle w:val="Guidance"/>
+        <w:spacing w:after="80"/>
+      </w:pPr>
+      <w:r>
+        <w:rPr>
+          <w:i/>
+          <w:color w:val="0F6F7D"/>
+          <w:sz w:val="18"/>
+        </w:rPr>
+        <w:t xml:space="preserve">Example: 70</w:t>
+      </w:r>
+    </w:p>
+    <w:p>
+      <w:pPr>
+        <w:pStyle w:val="Answer"/>
+        <w:spacing w:after="280"/>
+      </w:pPr>
+      <w:r>
+        <w:rPr>
+          <w:color w:val="999999"/>
+        </w:rPr>
+        <w:t>Type your answer here</w:t>
+      </w:r>
+    </w:p>
+    <w:p>
+      <w:pPr>
+        <w:pStyle w:val="Heading2"/>
+      </w:pPr>
+      <w:r>
+        <w:t xml:space="preserve">Last updated</w:t>
+      </w:r>
+    </w:p>
+    <w:p>
+      <w:pPr>
+        <w:pStyle w:val="Guidance"/>
+        <w:spacing w:after="80"/>
+      </w:pPr>
+      <w:r>
+        <w:rPr>
+          <w:i/>
+          <w:color w:val="5E6874"/>
+          <w:sz w:val="18"/>
+        </w:rPr>
+        <w:t xml:space="preserve">The date this information was last checked, as YYYY-MM-DD. Leave empty if you are not sure.</w:t>
+      </w:r>
+    </w:p>
+    <w:p>
+      <w:pPr>
+        <w:pStyle w:val="Guidance"/>
+        <w:spacing w:after="80"/>
+      </w:pPr>
+      <w:r>
+        <w:rPr>
+          <w:i/>
+          <w:color w:val="0F6F7D"/>
+          <w:sz w:val="18"/>
+        </w:rPr>
+        <w:t xml:space="preserve">Example: 2026-08-13</w:t>
       </w:r>
     </w:p>
     <w:p>

</xml_diff>